<commit_message>
cleaning up what is included in the repo
</commit_message>
<xml_diff>
--- a/Zhang-Gaudiano-2026-Merits-paper.docx
+++ b/Zhang-Gaudiano-2026-Merits-paper.docx
@@ -1122,12 +1122,10 @@
         <w:t>sitory (</w:t>
       </w:r>
       <w:r>
-        <w:rPr>
-          <w:b/>
-          <w:bCs/>
-          <w:highlight w:val="yellow"/>
-        </w:rPr>
-        <w:t>pending</w:t>
+        <w:t xml:space="preserve">available from the URL </w:t>
+      </w:r>
+      <w:r>
+        <w:t>https://doi.org/10.5281/zenodo.22866069</w:t>
       </w:r>
       <w:r>
         <w:rPr>
@@ -3365,22 +3363,31 @@
         <w:rPr>
           <w:bCs/>
         </w:rPr>
-        <w:t xml:space="preserve">The NetLogo model, simulation code, and raw output data supporting the results reported in this article are openly available in the JQIE-public repository at </w:t>
-      </w:r>
-      <w:hyperlink r:id="rId27" w:history="1">
-        <w:r>
-          <w:rPr>
-            <w:rStyle w:val="Hyperlink"/>
-            <w:bCs/>
-          </w:rPr>
-          <w:t>https://github.com/arcpaolo/JQIE-public</w:t>
-        </w:r>
-      </w:hyperlink>
+        <w:t xml:space="preserve">The NetLogo model, simulation code, and raw output data supporting the results reported in this article are openly available in the JQIE-public repository </w:t>
+      </w:r>
       <w:r>
         <w:rPr>
           <w:bCs/>
         </w:rPr>
-        <w:t xml:space="preserve"> (note: the current repo is a placeholder, a permanent DOI with a stable release will be available prior to final publication).</w:t>
+        <w:t xml:space="preserve">available </w:t>
+      </w:r>
+      <w:r>
+        <w:rPr>
+          <w:bCs/>
+        </w:rPr>
+        <w:t>at</w:t>
+      </w:r>
+      <w:r>
+        <w:t xml:space="preserve"> </w:t>
+      </w:r>
+      <w:r>
+        <w:t>https://doi.org/10.5281/zenodo.22866069</w:t>
+      </w:r>
+      <w:r>
+        <w:rPr>
+          <w:bCs/>
+        </w:rPr>
+        <w:t>.</w:t>
       </w:r>
     </w:p>
     <w:p>
@@ -4091,7 +4098,6 @@
         <w:ind w:left="425" w:hanging="425"/>
       </w:pPr>
       <w:r>
-        <w:lastRenderedPageBreak/>
         <w:t xml:space="preserve">Cappelli, P. </w:t>
       </w:r>
       <w:r>
@@ -4114,6 +4120,7 @@
         <w:ind w:left="425" w:hanging="425"/>
       </w:pPr>
       <w:r>
+        <w:lastRenderedPageBreak/>
         <w:t xml:space="preserve">Bonabeau, E. Agent-Based Modeling: Methods and Techniques for Simulating Human Systems. </w:t>
       </w:r>
       <w:r>
@@ -5610,11 +5617,11 @@
       </w:r>
     </w:p>
     <w:sectPr>
-      <w:headerReference w:type="even" r:id="rId28"/>
-      <w:headerReference w:type="default" r:id="rId29"/>
-      <w:footerReference w:type="default" r:id="rId30"/>
-      <w:headerReference w:type="first" r:id="rId31"/>
-      <w:footerReference w:type="first" r:id="rId32"/>
+      <w:headerReference w:type="even" r:id="rId27"/>
+      <w:headerReference w:type="default" r:id="rId28"/>
+      <w:footerReference w:type="default" r:id="rId29"/>
+      <w:headerReference w:type="first" r:id="rId30"/>
+      <w:footerReference w:type="first" r:id="rId31"/>
       <w:type w:val="continuous"/>
       <w:pgSz w:w="11906" w:h="16838" w:code="9"/>
       <w:pgMar w:top="1417" w:right="720" w:bottom="907" w:left="720" w:header="720" w:footer="612" w:gutter="0"/>

</xml_diff>